<commit_message>
Procedure EXOS-ADM-002-0 Rev 1: reflect new expense workflow (auto-read, Approved/Denied loop)
Regenerated via build_procedure.py: upload-only submit (amount/period/purpose
auto-read), manager Approved (->Done->Finance) / Denied (required reason ->
emails employee to resubmit), Finance payment. Bumps Master List + Process
Library to Rev 1. Generator now carries apply_link/apply_label through so the
'Submit an expense report' button survives regeneration.

Co-Authored-By: Claude Opus 4.8 <noreply@anthropic.com>
</commit_message>
<xml_diff>
--- a/process-library/11-administrative/EXOS-ADM-002-0_Expense_Report_Submission_Procedure.docx
+++ b/process-library/11-administrative/EXOS-ADM-002-0_Expense_Report_Submission_Procedure.docx
@@ -142,7 +142,7 @@
           <w:sz-cs w:val="29"/>
           <w:spacing w:val="0"/>
         </w:rPr>
-        <w:t xml:space="preserve">The purpose of this procedure is to provide employees a single, auditable process to submit, approve, and pay reimbursable business expenses entirely within Mission Control.</w:t>
+        <w:t xml:space="preserve">The purpose of this procedure is to provide a standard, self-service way for employees to submit expense reports and for managers and Finance to approve, deny, and pay them entirely within Mission Control, with the amount, period, and purpose read automatically from the uploaded report.</w:t>
       </w:r>
     </w:p>
     <w:p>
@@ -171,7 +171,7 @@
           <w:sz-cs w:val="29"/>
           <w:spacing w:val="0"/>
         </w:rPr>
-        <w:t xml:space="preserve">Employees submit expense reports from the Mission Control Expenses page. On submission the report routes automatically to the employee's manager (from the BambooHR org) for approval, then to the Finance role holders for payment. Status is tracked Submitted, Approved, Paid.</w:t>
+        <w:t xml:space="preserve">The entire expense process runs inside Mission Control. Employees download the house template, complete it, and upload it on the Expenses page; the system reads the total, expense period, and purpose directly from the file, so no values are retyped. The report routes to the employee's manager as an approval task pinned to the top of the board with the report attached. The manager either approves it (the task closes and payment auto-routes to Finance) or denies it with a required reason (the employee is emailed the reason and the report returns for correction and resubmission). Finance pays approved reports and the ledger records the report as Paid.</w:t>
       </w:r>
     </w:p>
     <w:p>
@@ -201,63 +201,91 @@
           <w:b/>
           <w:spacing w:val="0"/>
         </w:rPr>
-        <w:t xml:space="preserve">Task 1 - Prepare the report</w:t>
-      </w:r>
-    </w:p>
-    <w:p>
-      <w:pPr>
-        <w:spacing w:after="40"/>
-      </w:pPr>
-      <w:r>
-        <w:rPr>
-          <w:rFonts w:ascii="Arial" w:hAnsi="Arial" w:cs="Arial"/>
-          <w:sz w:val="29"/>
-          <w:sz-cs w:val="29"/>
-          <w:spacing w:val="0"/>
-        </w:rPr>
-        <w:t xml:space="preserve">_____ Open Mission Control and go to the Expenses page.</w:t>
-      </w:r>
-    </w:p>
-    <w:p>
-      <w:pPr>
-        <w:spacing w:after="40"/>
-      </w:pPr>
-      <w:r>
-        <w:rPr>
-          <w:rFonts w:ascii="Arial" w:hAnsi="Arial" w:cs="Arial"/>
-          <w:sz w:val="29"/>
-          <w:sz-cs w:val="29"/>
-          <w:spacing w:val="0"/>
-        </w:rPr>
-        <w:t xml:space="preserve">_____ Download the Exos Expense Report Template (.xlsx).</w:t>
-      </w:r>
-    </w:p>
-    <w:p>
-      <w:pPr>
-        <w:spacing w:after="40"/>
-      </w:pPr>
-      <w:r>
-        <w:rPr>
-          <w:rFonts w:ascii="Arial" w:hAnsi="Arial" w:cs="Arial"/>
-          <w:sz w:val="29"/>
-          <w:sz-cs w:val="29"/>
-          <w:spacing w:val="0"/>
-        </w:rPr>
-        <w:t xml:space="preserve">_____ Enter each expense line: date, category, description, amount. Retain receipts per Finance policy.</w:t>
-      </w:r>
-    </w:p>
-    <w:p>
-      <w:pPr>
-        <w:spacing w:after="40"/>
-      </w:pPr>
-      <w:r>
-        <w:rPr>
-          <w:rFonts w:ascii="Arial" w:hAnsi="Arial" w:cs="Arial"/>
-          <w:sz w:val="29"/>
-          <w:sz-cs w:val="29"/>
-          <w:spacing w:val="0"/>
-        </w:rPr>
-        <w:t xml:space="preserve">_____ Total the report.</w:t>
+        <w:t xml:space="preserve">Employee - submit your expense report</w:t>
+      </w:r>
+    </w:p>
+    <w:p>
+      <w:pPr>
+        <w:spacing w:after="40"/>
+      </w:pPr>
+      <w:r>
+        <w:rPr>
+          <w:rFonts w:ascii="Arial" w:hAnsi="Arial" w:cs="Arial"/>
+          <w:sz w:val="29"/>
+          <w:sz-cs w:val="29"/>
+          <w:spacing w:val="0"/>
+        </w:rPr>
+        <w:t xml:space="preserve">_____ Open Mission Control and go to the Expenses page (the Submit an expense report button on the Process and Procedures Library also links here).</w:t>
+      </w:r>
+    </w:p>
+    <w:p>
+      <w:pPr>
+        <w:spacing w:after="40"/>
+      </w:pPr>
+      <w:r>
+        <w:rPr>
+          <w:rFonts w:ascii="Arial" w:hAnsi="Arial" w:cs="Arial"/>
+          <w:sz w:val="29"/>
+          <w:sz-cs w:val="29"/>
+          <w:spacing w:val="0"/>
+        </w:rPr>
+        <w:t xml:space="preserve">_____ Download the current Expense Report template (.xlsx) from the top card.</w:t>
+      </w:r>
+    </w:p>
+    <w:p>
+      <w:pPr>
+        <w:spacing w:after="40"/>
+      </w:pPr>
+      <w:r>
+        <w:rPr>
+          <w:rFonts w:ascii="Arial" w:hAnsi="Arial" w:cs="Arial"/>
+          <w:sz w:val="29"/>
+          <w:sz-cs w:val="29"/>
+          <w:spacing w:val="0"/>
+        </w:rPr>
+        <w:t xml:space="preserve">_____ Complete the template: enter expenses by day, the WEEK ENDING date, and the Event Location / business purpose, and attach all receipts.</w:t>
+      </w:r>
+    </w:p>
+    <w:p>
+      <w:pPr>
+        <w:spacing w:after="40"/>
+      </w:pPr>
+      <w:r>
+        <w:rPr>
+          <w:rFonts w:ascii="Arial" w:hAnsi="Arial" w:cs="Arial"/>
+          <w:sz w:val="29"/>
+          <w:sz-cs w:val="29"/>
+          <w:spacing w:val="0"/>
+        </w:rPr>
+        <w:t xml:space="preserve">_____ Save the file, then upload it in the same card using Choose file.</w:t>
+      </w:r>
+    </w:p>
+    <w:p>
+      <w:pPr>
+        <w:spacing w:after="40"/>
+      </w:pPr>
+      <w:r>
+        <w:rPr>
+          <w:rFonts w:ascii="Arial" w:hAnsi="Arial" w:cs="Arial"/>
+          <w:sz w:val="29"/>
+          <w:sz-cs w:val="29"/>
+          <w:spacing w:val="0"/>
+        </w:rPr>
+        <w:t xml:space="preserve">_____ Click Submit for approval. Do NOT retype the amount, period, or purpose - Mission Control reads them automatically from your uploaded report.</w:t>
+      </w:r>
+    </w:p>
+    <w:p>
+      <w:pPr>
+        <w:spacing w:after="40"/>
+      </w:pPr>
+      <w:r>
+        <w:rPr>
+          <w:rFonts w:ascii="Arial" w:hAnsi="Arial" w:cs="Arial"/>
+          <w:sz w:val="29"/>
+          <w:sz-cs w:val="29"/>
+          <w:spacing w:val="0"/>
+        </w:rPr>
+        <w:t xml:space="preserve">_____ Track status any time under My expense reports on the Expenses page.</w:t>
       </w:r>
     </w:p>
     <w:p>
@@ -272,49 +300,77 @@
           <w:b/>
           <w:spacing w:val="0"/>
         </w:rPr>
-        <w:t xml:space="preserve">Task 2 - Submit for approval</w:t>
-      </w:r>
-    </w:p>
-    <w:p>
-      <w:pPr>
-        <w:spacing w:after="40"/>
-      </w:pPr>
-      <w:r>
-        <w:rPr>
-          <w:rFonts w:ascii="Arial" w:hAnsi="Arial" w:cs="Arial"/>
-          <w:sz w:val="29"/>
-          <w:sz-cs w:val="29"/>
-          <w:spacing w:val="0"/>
-        </w:rPr>
-        <w:t xml:space="preserve">_____ On the Expenses page, choose your completed file.</w:t>
-      </w:r>
-    </w:p>
-    <w:p>
-      <w:pPr>
-        <w:spacing w:after="40"/>
-      </w:pPr>
-      <w:r>
-        <w:rPr>
-          <w:rFonts w:ascii="Arial" w:hAnsi="Arial" w:cs="Arial"/>
-          <w:sz w:val="29"/>
-          <w:sz-cs w:val="29"/>
-          <w:spacing w:val="0"/>
-        </w:rPr>
-        <w:t xml:space="preserve">_____ Enter the total amount, expense period, and a short purpose.</w:t>
-      </w:r>
-    </w:p>
-    <w:p>
-      <w:pPr>
-        <w:spacing w:after="40"/>
-      </w:pPr>
-      <w:r>
-        <w:rPr>
-          <w:rFonts w:ascii="Arial" w:hAnsi="Arial" w:cs="Arial"/>
-          <w:sz w:val="29"/>
-          <w:sz-cs w:val="29"/>
-          <w:spacing w:val="0"/>
-        </w:rPr>
-        <w:t xml:space="preserve">_____ Click Submit for approval; Mission Control creates the manager approval task automatically.</w:t>
+        <w:t xml:space="preserve">Manager - review and decide</w:t>
+      </w:r>
+    </w:p>
+    <w:p>
+      <w:pPr>
+        <w:spacing w:after="40"/>
+      </w:pPr>
+      <w:r>
+        <w:rPr>
+          <w:rFonts w:ascii="Arial" w:hAnsi="Arial" w:cs="Arial"/>
+          <w:sz w:val="29"/>
+          <w:sz-cs w:val="29"/>
+          <w:spacing w:val="0"/>
+        </w:rPr>
+        <w:t xml:space="preserve">_____ Open the approval task at the top of your Mission Control board (Approve expense report - [employee] ($amount)).</w:t>
+      </w:r>
+    </w:p>
+    <w:p>
+      <w:pPr>
+        <w:spacing w:after="40"/>
+      </w:pPr>
+      <w:r>
+        <w:rPr>
+          <w:rFonts w:ascii="Arial" w:hAnsi="Arial" w:cs="Arial"/>
+          <w:sz w:val="29"/>
+          <w:sz-cs w:val="29"/>
+          <w:spacing w:val="0"/>
+        </w:rPr>
+        <w:t xml:space="preserve">_____ Click Open expense report (or the Documents tab) to review the attached report and receipts; amount, period, and purpose are shown auto-read from the file.</w:t>
+      </w:r>
+    </w:p>
+    <w:p>
+      <w:pPr>
+        <w:spacing w:after="40"/>
+      </w:pPr>
+      <w:r>
+        <w:rPr>
+          <w:rFonts w:ascii="Arial" w:hAnsi="Arial" w:cs="Arial"/>
+          <w:sz w:val="29"/>
+          <w:sz-cs w:val="29"/>
+          <w:spacing w:val="0"/>
+        </w:rPr>
+        <w:t xml:space="preserve">_____ If correct, click Approved. The task moves to Done and payment auto-routes to Finance.</w:t>
+      </w:r>
+    </w:p>
+    <w:p>
+      <w:pPr>
+        <w:spacing w:after="40"/>
+      </w:pPr>
+      <w:r>
+        <w:rPr>
+          <w:rFonts w:ascii="Arial" w:hAnsi="Arial" w:cs="Arial"/>
+          <w:sz w:val="29"/>
+          <w:sz-cs w:val="29"/>
+          <w:spacing w:val="0"/>
+        </w:rPr>
+        <w:t xml:space="preserve">_____ If changes are needed, click Denied, enter the reason (required), and click Deny and send back to employee.</w:t>
+      </w:r>
+    </w:p>
+    <w:p>
+      <w:pPr>
+        <w:spacing w:after="40"/>
+      </w:pPr>
+      <w:r>
+        <w:rPr>
+          <w:rFonts w:ascii="Arial" w:hAnsi="Arial" w:cs="Arial"/>
+          <w:sz w:val="29"/>
+          <w:sz-cs w:val="29"/>
+          <w:spacing w:val="0"/>
+        </w:rPr>
+        <w:t xml:space="preserve">_____ On denial the employee is emailed the reason automatically, the report is returned for correction, and no payment is issued.</w:t>
       </w:r>
     </w:p>
     <w:p>
@@ -329,49 +385,49 @@
           <w:b/>
           <w:spacing w:val="0"/>
         </w:rPr>
-        <w:t xml:space="preserve">Task 3 - Manager approval</w:t>
-      </w:r>
-    </w:p>
-    <w:p>
-      <w:pPr>
-        <w:spacing w:after="40"/>
-      </w:pPr>
-      <w:r>
-        <w:rPr>
-          <w:rFonts w:ascii="Arial" w:hAnsi="Arial" w:cs="Arial"/>
-          <w:sz w:val="29"/>
-          <w:sz-cs w:val="29"/>
-          <w:spacing w:val="0"/>
-        </w:rPr>
-        <w:t xml:space="preserve">_____ Manager receives the approval task (auto-notified) with the report attached.</w:t>
-      </w:r>
-    </w:p>
-    <w:p>
-      <w:pPr>
-        <w:spacing w:after="40"/>
-      </w:pPr>
-      <w:r>
-        <w:rPr>
-          <w:rFonts w:ascii="Arial" w:hAnsi="Arial" w:cs="Arial"/>
-          <w:sz w:val="29"/>
-          <w:sz-cs w:val="29"/>
-          <w:spacing w:val="0"/>
-        </w:rPr>
-        <w:t xml:space="preserve">_____ Manager reviews the report against policy.</w:t>
-      </w:r>
-    </w:p>
-    <w:p>
-      <w:pPr>
-        <w:spacing w:after="40"/>
-      </w:pPr>
-      <w:r>
-        <w:rPr>
-          <w:rFonts w:ascii="Arial" w:hAnsi="Arial" w:cs="Arial"/>
-          <w:sz w:val="29"/>
-          <w:sz-cs w:val="29"/>
-          <w:spacing w:val="0"/>
-        </w:rPr>
-        <w:t xml:space="preserve">_____ Manager approves by marking the task Done, or returns it for correction.</w:t>
+        <w:t xml:space="preserve">Finance - pay approved reports</w:t>
+      </w:r>
+    </w:p>
+    <w:p>
+      <w:pPr>
+        <w:spacing w:after="40"/>
+      </w:pPr>
+      <w:r>
+        <w:rPr>
+          <w:rFonts w:ascii="Arial" w:hAnsi="Arial" w:cs="Arial"/>
+          <w:sz w:val="29"/>
+          <w:sz-cs w:val="29"/>
+          <w:spacing w:val="0"/>
+        </w:rPr>
+        <w:t xml:space="preserve">_____ An approved report generates a payment task for the Finance role holders defined in expense-roles.json.</w:t>
+      </w:r>
+    </w:p>
+    <w:p>
+      <w:pPr>
+        <w:spacing w:after="40"/>
+      </w:pPr>
+      <w:r>
+        <w:rPr>
+          <w:rFonts w:ascii="Arial" w:hAnsi="Arial" w:cs="Arial"/>
+          <w:sz w:val="29"/>
+          <w:sz-cs w:val="29"/>
+          <w:spacing w:val="0"/>
+        </w:rPr>
+        <w:t xml:space="preserve">_____ Process the reimbursement per Finance policy, then mark the payment task Done.</w:t>
+      </w:r>
+    </w:p>
+    <w:p>
+      <w:pPr>
+        <w:spacing w:after="40"/>
+      </w:pPr>
+      <w:r>
+        <w:rPr>
+          <w:rFonts w:ascii="Arial" w:hAnsi="Arial" w:cs="Arial"/>
+          <w:sz w:val="29"/>
+          <w:sz-cs w:val="29"/>
+          <w:spacing w:val="0"/>
+        </w:rPr>
+        <w:t xml:space="preserve">_____ When all payment tasks are Done, Mission Control records the report as Paid.</w:t>
       </w:r>
     </w:p>
     <w:p>
@@ -386,63 +442,6 @@
           <w:b/>
           <w:spacing w:val="0"/>
         </w:rPr>
-        <w:t xml:space="preserve">Task 4 - Finance payment</w:t>
-      </w:r>
-    </w:p>
-    <w:p>
-      <w:pPr>
-        <w:spacing w:after="40"/>
-      </w:pPr>
-      <w:r>
-        <w:rPr>
-          <w:rFonts w:ascii="Arial" w:hAnsi="Arial" w:cs="Arial"/>
-          <w:sz w:val="29"/>
-          <w:sz-cs w:val="29"/>
-          <w:spacing w:val="0"/>
-        </w:rPr>
-        <w:t xml:space="preserve">_____ On approval, Mission Control creates payment tasks for the Finance role holders (CFO/Finance and BD/AP).</w:t>
-      </w:r>
-    </w:p>
-    <w:p>
-      <w:pPr>
-        <w:spacing w:after="40"/>
-      </w:pPr>
-      <w:r>
-        <w:rPr>
-          <w:rFonts w:ascii="Arial" w:hAnsi="Arial" w:cs="Arial"/>
-          <w:sz w:val="29"/>
-          <w:sz-cs w:val="29"/>
-          <w:spacing w:val="0"/>
-        </w:rPr>
-        <w:t xml:space="preserve">_____ Finance verifies and processes payment.</w:t>
-      </w:r>
-    </w:p>
-    <w:p>
-      <w:pPr>
-        <w:spacing w:after="40"/>
-      </w:pPr>
-      <w:r>
-        <w:rPr>
-          <w:rFonts w:ascii="Arial" w:hAnsi="Arial" w:cs="Arial"/>
-          <w:sz w:val="29"/>
-          <w:sz-cs w:val="29"/>
-          <w:spacing w:val="0"/>
-        </w:rPr>
-        <w:t xml:space="preserve">_____ Finance marks the payment task Done; the report then shows Paid on the employee Expenses page.</w:t>
-      </w:r>
-    </w:p>
-    <w:p>
-      <w:pPr>
-        <w:spacing w:after="343"/>
-      </w:pPr>
-      <w:r>
-        <w:rPr>
-          <w:rFonts w:ascii="Arial" w:hAnsi="Arial" w:cs="Arial"/>
-          <w:sz w:val="34"/>
-          <w:sz-cs w:val="34"/>
-          <w:b/>
-          <w:spacing w:val="0"/>
-        </w:rPr>
         <w:t xml:space="preserve">Completion</w:t>
       </w:r>
     </w:p>
@@ -499,7 +498,7 @@
           <w:spacing w:val="0"/>
           <w:color w:val="434343"/>
         </w:rPr>
-        <w:t xml:space="preserve">This is a copy of the procedure. Valid for today's date only. Owner: Kyle Ballard (Finance) / Exo · Reference documents: Exos Expense Report Template (ADM-EXP-01) · EXOS-ADM-002-0 Rev 0 · Process &amp; Procedure Control per EXOS-US-QMS-001.</w:t>
+        <w:t xml:space="preserve">This is a copy of the procedure. Valid for today's date only. Owner: Kyle Ballard (Finance) / Exo · Reference documents: Exos Expense Report Template (ADM-EXP-01) · EXOS-ADM-002-0 Rev 1 · Process &amp; Procedure Control per EXOS-US-QMS-001.</w:t>
       </w:r>
     </w:p>
     <w:sectPr/>

</xml_diff>

<commit_message>
Expenses: native web-form entry + Exobot area-cost pre-screen + mileage auto-calc + monitoring
Replaces the download/upload Excel flow with a line-item web form (mission-control/expenses.html):
per-line date/category/description/location/amount, mileage auto-computed at the IRS rate
(expense-norms.json). New /api/expense/create runs scripts/expense_screen.py BEFORE routing —
checks each line vs area-normal cost bands (high-cost-metro caps), verifies mileage math,
detects duplicates — and attaches flags to the reviewer's approval task (flagged reports
prioritized + tagged). Adds /api/expense/norms. scripts/expense_analytics.py + monthly
launchd digest report mileage reimbursement per employee and out-of-normal expenses.
Procedure EXOS-ADM-002 updated to rev 1.

Co-Authored-By: Claude Opus 4.8 <noreply@anthropic.com>
</commit_message>
<xml_diff>
--- a/process-library/11-administrative/EXOS-ADM-002-0_Expense_Report_Submission_Procedure.docx
+++ b/process-library/11-administrative/EXOS-ADM-002-0_Expense_Report_Submission_Procedure.docx
@@ -40,7 +40,7 @@
           <w:sz-cs w:val="29"/>
           <w:spacing w:val="0"/>
         </w:rPr>
-        <w:t xml:space="preserve">DATE: 08/10/2026</w:t>
+        <w:t xml:space="preserve">DATE: 08/13/2026</w:t>
       </w:r>
     </w:p>
     <w:p>
@@ -142,7 +142,7 @@
           <w:sz-cs w:val="29"/>
           <w:spacing w:val="0"/>
         </w:rPr>
-        <w:t xml:space="preserve">The purpose of this procedure is to provide a standard, self-service way for employees to submit expense reports and for managers and Finance to approve, deny, and pay them entirely within Mission Control, with the amount, period, and purpose read automatically from the uploaded report.</w:t>
+        <w:t xml:space="preserve">The purpose of this procedure is to provide employees a single, auditable process to create, screen, approve, and pay reimbursable business expenses entirely within Mission Control, with no spreadsheets to download or upload.</w:t>
       </w:r>
     </w:p>
     <w:p>
@@ -171,7 +171,7 @@
           <w:sz-cs w:val="29"/>
           <w:spacing w:val="0"/>
         </w:rPr>
-        <w:t xml:space="preserve">The entire expense process runs inside Mission Control. Employees download the house template, complete it, and upload it on the Expenses page; the system reads the total, expense period, and purpose directly from the file, so no values are retyped. The report routes to the employee's manager as an approval task pinned to the top of the board with the report attached. The manager either approves it (the task closes and payment auto-routes to Finance) or denies it with a required reason (the employee is emailed the reason and the report returns for correction and resubmission). Finance pays approved reports and the ledger records the report as Paid.</w:t>
+        <w:t xml:space="preserve">Employees enter expenses directly on the Mission Control Expenses page as line items. Mileage is calculated automatically at the current IRS standard rate. On submission, Exobot pre-screens every line against area-normal cost bands and attaches any flags to the approval task, so the reviewer sees concerns before approving. The report then routes automatically to the employee's manager (from the BambooHR org) for approval, then to Finance for payment. Status is tracked Submitted, Approved, Paid, or Denied. Exobot also produces a monthly monitoring digest (mileage reimbursement by employee and any out-of-normal expenses).</w:t>
       </w:r>
     </w:p>
     <w:p>
@@ -201,91 +201,77 @@
           <w:b/>
           <w:spacing w:val="0"/>
         </w:rPr>
-        <w:t xml:space="preserve">Employee - submit your expense report</w:t>
-      </w:r>
-    </w:p>
-    <w:p>
-      <w:pPr>
-        <w:spacing w:after="40"/>
-      </w:pPr>
-      <w:r>
-        <w:rPr>
-          <w:rFonts w:ascii="Arial" w:hAnsi="Arial" w:cs="Arial"/>
-          <w:sz w:val="29"/>
-          <w:sz-cs w:val="29"/>
-          <w:spacing w:val="0"/>
-        </w:rPr>
-        <w:t xml:space="preserve">_____ Open Mission Control and go to the Expenses page (the Submit an expense report button on the Process and Procedures Library also links here).</w:t>
-      </w:r>
-    </w:p>
-    <w:p>
-      <w:pPr>
-        <w:spacing w:after="40"/>
-      </w:pPr>
-      <w:r>
-        <w:rPr>
-          <w:rFonts w:ascii="Arial" w:hAnsi="Arial" w:cs="Arial"/>
-          <w:sz w:val="29"/>
-          <w:sz-cs w:val="29"/>
-          <w:spacing w:val="0"/>
-        </w:rPr>
-        <w:t xml:space="preserve">_____ Download the current Expense Report template (.xlsx) from the top card.</w:t>
-      </w:r>
-    </w:p>
-    <w:p>
-      <w:pPr>
-        <w:spacing w:after="40"/>
-      </w:pPr>
-      <w:r>
-        <w:rPr>
-          <w:rFonts w:ascii="Arial" w:hAnsi="Arial" w:cs="Arial"/>
-          <w:sz w:val="29"/>
-          <w:sz-cs w:val="29"/>
-          <w:spacing w:val="0"/>
-        </w:rPr>
-        <w:t xml:space="preserve">_____ Complete the template: enter expenses by day, the WEEK ENDING date, and the Event Location / business purpose, and attach all receipts.</w:t>
-      </w:r>
-    </w:p>
-    <w:p>
-      <w:pPr>
-        <w:spacing w:after="40"/>
-      </w:pPr>
-      <w:r>
-        <w:rPr>
-          <w:rFonts w:ascii="Arial" w:hAnsi="Arial" w:cs="Arial"/>
-          <w:sz w:val="29"/>
-          <w:sz-cs w:val="29"/>
-          <w:spacing w:val="0"/>
-        </w:rPr>
-        <w:t xml:space="preserve">_____ Save the file, then upload it in the same card using Choose file.</w:t>
-      </w:r>
-    </w:p>
-    <w:p>
-      <w:pPr>
-        <w:spacing w:after="40"/>
-      </w:pPr>
-      <w:r>
-        <w:rPr>
-          <w:rFonts w:ascii="Arial" w:hAnsi="Arial" w:cs="Arial"/>
-          <w:sz w:val="29"/>
-          <w:sz-cs w:val="29"/>
-          <w:spacing w:val="0"/>
-        </w:rPr>
-        <w:t xml:space="preserve">_____ Click Submit for approval. Do NOT retype the amount, period, or purpose - Mission Control reads them automatically from your uploaded report.</w:t>
-      </w:r>
-    </w:p>
-    <w:p>
-      <w:pPr>
-        <w:spacing w:after="40"/>
-      </w:pPr>
-      <w:r>
-        <w:rPr>
-          <w:rFonts w:ascii="Arial" w:hAnsi="Arial" w:cs="Arial"/>
-          <w:sz w:val="29"/>
-          <w:sz-cs w:val="29"/>
-          <w:spacing w:val="0"/>
-        </w:rPr>
-        <w:t xml:space="preserve">_____ Track status any time under My expense reports on the Expenses page.</w:t>
+        <w:t xml:space="preserve">Task 1 - Create the report (web form)</w:t>
+      </w:r>
+    </w:p>
+    <w:p>
+      <w:pPr>
+        <w:spacing w:after="40"/>
+      </w:pPr>
+      <w:r>
+        <w:rPr>
+          <w:rFonts w:ascii="Arial" w:hAnsi="Arial" w:cs="Arial"/>
+          <w:sz w:val="29"/>
+          <w:sz-cs w:val="29"/>
+          <w:spacing w:val="0"/>
+        </w:rPr>
+        <w:t xml:space="preserve">_____ Open Mission Control and go to the Expenses page.</w:t>
+      </w:r>
+    </w:p>
+    <w:p>
+      <w:pPr>
+        <w:spacing w:after="40"/>
+      </w:pPr>
+      <w:r>
+        <w:rPr>
+          <w:rFonts w:ascii="Arial" w:hAnsi="Arial" w:cs="Arial"/>
+          <w:sz w:val="29"/>
+          <w:sz-cs w:val="29"/>
+          <w:spacing w:val="0"/>
+        </w:rPr>
+        <w:t xml:space="preserve">_____ Enter a Purpose/trip and Period for the report.</w:t>
+      </w:r>
+    </w:p>
+    <w:p>
+      <w:pPr>
+        <w:spacing w:after="40"/>
+      </w:pPr>
+      <w:r>
+        <w:rPr>
+          <w:rFonts w:ascii="Arial" w:hAnsi="Arial" w:cs="Arial"/>
+          <w:sz w:val="29"/>
+          <w:sz-cs w:val="29"/>
+          <w:spacing w:val="0"/>
+        </w:rPr>
+        <w:t xml:space="preserve">_____ Add a line for each expense: Date, Category, Description, Location (city, ST), and Amount.</w:t>
+      </w:r>
+    </w:p>
+    <w:p>
+      <w:pPr>
+        <w:spacing w:after="40"/>
+      </w:pPr>
+      <w:r>
+        <w:rPr>
+          <w:rFonts w:ascii="Arial" w:hAnsi="Arial" w:cs="Arial"/>
+          <w:sz w:val="29"/>
+          <w:sz-cs w:val="29"/>
+          <w:spacing w:val="0"/>
+        </w:rPr>
+        <w:t xml:space="preserve">_____ For mileage, choose category Mileage and enter miles - the reimbursement is calculated automatically at the current IRS rate (read from expense-norms.json).</w:t>
+      </w:r>
+    </w:p>
+    <w:p>
+      <w:pPr>
+        <w:spacing w:after="40"/>
+      </w:pPr>
+      <w:r>
+        <w:rPr>
+          <w:rFonts w:ascii="Arial" w:hAnsi="Arial" w:cs="Arial"/>
+          <w:sz w:val="29"/>
+          <w:sz-cs w:val="29"/>
+          <w:spacing w:val="0"/>
+        </w:rPr>
+        <w:t xml:space="preserve">_____ Attach receipt(s) if needed (optional). The running total updates as you add lines.</w:t>
       </w:r>
     </w:p>
     <w:p>
@@ -300,77 +286,63 @@
           <w:b/>
           <w:spacing w:val="0"/>
         </w:rPr>
-        <w:t xml:space="preserve">Manager - review and decide</w:t>
-      </w:r>
-    </w:p>
-    <w:p>
-      <w:pPr>
-        <w:spacing w:after="40"/>
-      </w:pPr>
-      <w:r>
-        <w:rPr>
-          <w:rFonts w:ascii="Arial" w:hAnsi="Arial" w:cs="Arial"/>
-          <w:sz w:val="29"/>
-          <w:sz-cs w:val="29"/>
-          <w:spacing w:val="0"/>
-        </w:rPr>
-        <w:t xml:space="preserve">_____ Open the approval task at the top of your Mission Control board (Approve expense report - [employee] ($amount)).</w:t>
-      </w:r>
-    </w:p>
-    <w:p>
-      <w:pPr>
-        <w:spacing w:after="40"/>
-      </w:pPr>
-      <w:r>
-        <w:rPr>
-          <w:rFonts w:ascii="Arial" w:hAnsi="Arial" w:cs="Arial"/>
-          <w:sz w:val="29"/>
-          <w:sz-cs w:val="29"/>
-          <w:spacing w:val="0"/>
-        </w:rPr>
-        <w:t xml:space="preserve">_____ Click Open expense report (or the Documents tab) to review the attached report and receipts; amount, period, and purpose are shown auto-read from the file.</w:t>
-      </w:r>
-    </w:p>
-    <w:p>
-      <w:pPr>
-        <w:spacing w:after="40"/>
-      </w:pPr>
-      <w:r>
-        <w:rPr>
-          <w:rFonts w:ascii="Arial" w:hAnsi="Arial" w:cs="Arial"/>
-          <w:sz w:val="29"/>
-          <w:sz-cs w:val="29"/>
-          <w:spacing w:val="0"/>
-        </w:rPr>
-        <w:t xml:space="preserve">_____ If correct, click Approved. The task moves to Done and payment auto-routes to Finance.</w:t>
-      </w:r>
-    </w:p>
-    <w:p>
-      <w:pPr>
-        <w:spacing w:after="40"/>
-      </w:pPr>
-      <w:r>
-        <w:rPr>
-          <w:rFonts w:ascii="Arial" w:hAnsi="Arial" w:cs="Arial"/>
-          <w:sz w:val="29"/>
-          <w:sz-cs w:val="29"/>
-          <w:spacing w:val="0"/>
-        </w:rPr>
-        <w:t xml:space="preserve">_____ If changes are needed, click Denied, enter the reason (required), and click Deny and send back to employee.</w:t>
-      </w:r>
-    </w:p>
-    <w:p>
-      <w:pPr>
-        <w:spacing w:after="40"/>
-      </w:pPr>
-      <w:r>
-        <w:rPr>
-          <w:rFonts w:ascii="Arial" w:hAnsi="Arial" w:cs="Arial"/>
-          <w:sz w:val="29"/>
-          <w:sz-cs w:val="29"/>
-          <w:spacing w:val="0"/>
-        </w:rPr>
-        <w:t xml:space="preserve">_____ On denial the employee is emailed the reason automatically, the report is returned for correction, and no payment is issued.</w:t>
+        <w:t xml:space="preserve">Task 2 - Submit and Exobot pre-screen</w:t>
+      </w:r>
+    </w:p>
+    <w:p>
+      <w:pPr>
+        <w:spacing w:after="40"/>
+      </w:pPr>
+      <w:r>
+        <w:rPr>
+          <w:rFonts w:ascii="Arial" w:hAnsi="Arial" w:cs="Arial"/>
+          <w:sz w:val="29"/>
+          <w:sz-cs w:val="29"/>
+          <w:spacing w:val="0"/>
+        </w:rPr>
+        <w:t xml:space="preserve">_____ Click Submit for approval.</w:t>
+      </w:r>
+    </w:p>
+    <w:p>
+      <w:pPr>
+        <w:spacing w:after="40"/>
+      </w:pPr>
+      <w:r>
+        <w:rPr>
+          <w:rFonts w:ascii="Arial" w:hAnsi="Arial" w:cs="Arial"/>
+          <w:sz w:val="29"/>
+          <w:sz-cs w:val="29"/>
+          <w:spacing w:val="0"/>
+        </w:rPr>
+        <w:t xml:space="preserve">_____ Exobot pre-screens each line against area-normal cost bands (lodging, meals, ground transport, etc.), applies high-cost-area caps, checks mileage math, and detects likely duplicates.</w:t>
+      </w:r>
+    </w:p>
+    <w:p>
+      <w:pPr>
+        <w:spacing w:after="40"/>
+      </w:pPr>
+      <w:r>
+        <w:rPr>
+          <w:rFonts w:ascii="Arial" w:hAnsi="Arial" w:cs="Arial"/>
+          <w:sz w:val="29"/>
+          <w:sz-cs w:val="29"/>
+          <w:spacing w:val="0"/>
+        </w:rPr>
+        <w:t xml:space="preserve">_____ Any flags are shown to you immediately and attached to the reviewer's approval task. Reports with flags are marked with a warning and prioritized for the reviewer.</w:t>
+      </w:r>
+    </w:p>
+    <w:p>
+      <w:pPr>
+        <w:spacing w:after="40"/>
+      </w:pPr>
+      <w:r>
+        <w:rPr>
+          <w:rFonts w:ascii="Arial" w:hAnsi="Arial" w:cs="Arial"/>
+          <w:sz w:val="29"/>
+          <w:sz-cs w:val="29"/>
+          <w:spacing w:val="0"/>
+        </w:rPr>
+        <w:t xml:space="preserve">_____ Mission Control creates the manager approval task automatically.</w:t>
       </w:r>
     </w:p>
     <w:p>
@@ -385,49 +357,49 @@
           <w:b/>
           <w:spacing w:val="0"/>
         </w:rPr>
-        <w:t xml:space="preserve">Finance - pay approved reports</w:t>
-      </w:r>
-    </w:p>
-    <w:p>
-      <w:pPr>
-        <w:spacing w:after="40"/>
-      </w:pPr>
-      <w:r>
-        <w:rPr>
-          <w:rFonts w:ascii="Arial" w:hAnsi="Arial" w:cs="Arial"/>
-          <w:sz w:val="29"/>
-          <w:sz-cs w:val="29"/>
-          <w:spacing w:val="0"/>
-        </w:rPr>
-        <w:t xml:space="preserve">_____ An approved report generates a payment task for the Finance role holders defined in expense-roles.json.</w:t>
-      </w:r>
-    </w:p>
-    <w:p>
-      <w:pPr>
-        <w:spacing w:after="40"/>
-      </w:pPr>
-      <w:r>
-        <w:rPr>
-          <w:rFonts w:ascii="Arial" w:hAnsi="Arial" w:cs="Arial"/>
-          <w:sz w:val="29"/>
-          <w:sz-cs w:val="29"/>
-          <w:spacing w:val="0"/>
-        </w:rPr>
-        <w:t xml:space="preserve">_____ Process the reimbursement per Finance policy, then mark the payment task Done.</w:t>
-      </w:r>
-    </w:p>
-    <w:p>
-      <w:pPr>
-        <w:spacing w:after="40"/>
-      </w:pPr>
-      <w:r>
-        <w:rPr>
-          <w:rFonts w:ascii="Arial" w:hAnsi="Arial" w:cs="Arial"/>
-          <w:sz w:val="29"/>
-          <w:sz-cs w:val="29"/>
-          <w:spacing w:val="0"/>
-        </w:rPr>
-        <w:t xml:space="preserve">_____ When all payment tasks are Done, Mission Control records the report as Paid.</w:t>
+        <w:t xml:space="preserve">Task 3 - Manager approval</w:t>
+      </w:r>
+    </w:p>
+    <w:p>
+      <w:pPr>
+        <w:spacing w:after="40"/>
+      </w:pPr>
+      <w:r>
+        <w:rPr>
+          <w:rFonts w:ascii="Arial" w:hAnsi="Arial" w:cs="Arial"/>
+          <w:sz w:val="29"/>
+          <w:sz-cs w:val="29"/>
+          <w:spacing w:val="0"/>
+        </w:rPr>
+        <w:t xml:space="preserve">_____ Manager receives the approval task (auto-notified) with the itemized lines and the Exobot pre-screen results.</w:t>
+      </w:r>
+    </w:p>
+    <w:p>
+      <w:pPr>
+        <w:spacing w:after="40"/>
+      </w:pPr>
+      <w:r>
+        <w:rPr>
+          <w:rFonts w:ascii="Arial" w:hAnsi="Arial" w:cs="Arial"/>
+          <w:sz w:val="29"/>
+          <w:sz-cs w:val="29"/>
+          <w:spacing w:val="0"/>
+        </w:rPr>
+        <w:t xml:space="preserve">_____ Manager reviews flagged items first, then the report against policy.</w:t>
+      </w:r>
+    </w:p>
+    <w:p>
+      <w:pPr>
+        <w:spacing w:after="40"/>
+      </w:pPr>
+      <w:r>
+        <w:rPr>
+          <w:rFonts w:ascii="Arial" w:hAnsi="Arial" w:cs="Arial"/>
+          <w:sz w:val="29"/>
+          <w:sz-cs w:val="29"/>
+          <w:spacing w:val="0"/>
+        </w:rPr>
+        <w:t xml:space="preserve">_____ Manager approves by marking the task Done, or denies with a required reason (which emails the employee to revise and resubmit).</w:t>
       </w:r>
     </w:p>
     <w:p>
@@ -442,6 +414,120 @@
           <w:b/>
           <w:spacing w:val="0"/>
         </w:rPr>
+        <w:t xml:space="preserve">Task 4 - Finance payment</w:t>
+      </w:r>
+    </w:p>
+    <w:p>
+      <w:pPr>
+        <w:spacing w:after="40"/>
+      </w:pPr>
+      <w:r>
+        <w:rPr>
+          <w:rFonts w:ascii="Arial" w:hAnsi="Arial" w:cs="Arial"/>
+          <w:sz w:val="29"/>
+          <w:sz-cs w:val="29"/>
+          <w:spacing w:val="0"/>
+        </w:rPr>
+        <w:t xml:space="preserve">_____ On approval, Mission Control creates a single payment task for the Finance payer (CFO/Finance; the submitter is never routed their own payment).</w:t>
+      </w:r>
+    </w:p>
+    <w:p>
+      <w:pPr>
+        <w:spacing w:after="40"/>
+      </w:pPr>
+      <w:r>
+        <w:rPr>
+          <w:rFonts w:ascii="Arial" w:hAnsi="Arial" w:cs="Arial"/>
+          <w:sz w:val="29"/>
+          <w:sz-cs w:val="29"/>
+          <w:spacing w:val="0"/>
+        </w:rPr>
+        <w:t xml:space="preserve">_____ Finance verifies and processes payment.</w:t>
+      </w:r>
+    </w:p>
+    <w:p>
+      <w:pPr>
+        <w:spacing w:after="40"/>
+      </w:pPr>
+      <w:r>
+        <w:rPr>
+          <w:rFonts w:ascii="Arial" w:hAnsi="Arial" w:cs="Arial"/>
+          <w:sz w:val="29"/>
+          <w:sz-cs w:val="29"/>
+          <w:spacing w:val="0"/>
+        </w:rPr>
+        <w:t xml:space="preserve">_____ Finance marks the payment task Done; the report then shows Paid on the employee Expenses page.</w:t>
+      </w:r>
+    </w:p>
+    <w:p>
+      <w:pPr>
+        <w:spacing w:after="343"/>
+      </w:pPr>
+      <w:r>
+        <w:rPr>
+          <w:rFonts w:ascii="Arial" w:hAnsi="Arial" w:cs="Arial"/>
+          <w:sz w:val="34"/>
+          <w:sz-cs w:val="34"/>
+          <w:b/>
+          <w:spacing w:val="0"/>
+        </w:rPr>
+        <w:t xml:space="preserve">Task 5 - Monitoring (Exobot)</w:t>
+      </w:r>
+    </w:p>
+    <w:p>
+      <w:pPr>
+        <w:spacing w:after="40"/>
+      </w:pPr>
+      <w:r>
+        <w:rPr>
+          <w:rFonts w:ascii="Arial" w:hAnsi="Arial" w:cs="Arial"/>
+          <w:sz w:val="29"/>
+          <w:sz-cs w:val="29"/>
+          <w:spacing w:val="0"/>
+        </w:rPr>
+        <w:t xml:space="preserve">_____ Exobot maintains area-cost norms in expense-norms.json and updates the IRS mileage rate there when it changes.</w:t>
+      </w:r>
+    </w:p>
+    <w:p>
+      <w:pPr>
+        <w:spacing w:after="40"/>
+      </w:pPr>
+      <w:r>
+        <w:rPr>
+          <w:rFonts w:ascii="Arial" w:hAnsi="Arial" w:cs="Arial"/>
+          <w:sz w:val="29"/>
+          <w:sz-cs w:val="29"/>
+          <w:spacing w:val="0"/>
+        </w:rPr>
+        <w:t xml:space="preserve">_____ A monthly digest reports mileage reimbursement per employee and any expenses outside area-normal ranges, emailed to leadership.</w:t>
+      </w:r>
+    </w:p>
+    <w:p>
+      <w:pPr>
+        <w:spacing w:after="40"/>
+      </w:pPr>
+      <w:r>
+        <w:rPr>
+          <w:rFonts w:ascii="Arial" w:hAnsi="Arial" w:cs="Arial"/>
+          <w:sz w:val="29"/>
+          <w:sz-cs w:val="29"/>
+          <w:spacing w:val="0"/>
+        </w:rPr>
+        <w:t xml:space="preserve">_____ Norms can be tuned over time from actual spend.</w:t>
+      </w:r>
+    </w:p>
+    <w:p>
+      <w:pPr>
+        <w:spacing w:after="343"/>
+      </w:pPr>
+      <w:r>
+        <w:rPr>
+          <w:rFonts w:ascii="Arial" w:hAnsi="Arial" w:cs="Arial"/>
+          <w:sz w:val="34"/>
+          <w:sz-cs w:val="34"/>
+          <w:b/>
+          <w:spacing w:val="0"/>
+        </w:rPr>
         <w:t xml:space="preserve">Completion</w:t>
       </w:r>
     </w:p>
@@ -498,7 +584,7 @@
           <w:spacing w:val="0"/>
           <w:color w:val="434343"/>
         </w:rPr>
-        <w:t xml:space="preserve">This is a copy of the procedure. Valid for today's date only. Owner: Kyle Ballard (Finance) / Exo · Reference documents: Exos Expense Report Template (ADM-EXP-01) · EXOS-ADM-002-0 Rev 1 · Process &amp; Procedure Control per EXOS-US-QMS-001.</w:t>
+        <w:t xml:space="preserve">This is a copy of the procedure. Valid for today's date only. Owner: Kyle Ballard (Finance) / Exo · Reference documents: Mission Control Expenses page; expense-norms.json (area-cost bands + IRS mileage rate) · EXOS-ADM-002-0 Rev 1 · Process &amp; Procedure Control per EXOS-US-QMS-001.</w:t>
       </w:r>
     </w:p>
     <w:sectPr/>

</xml_diff>